<commit_message>
adding day2 power bi
</commit_message>
<xml_diff>
--- a/Power BI/Day2/Lab/Power BI Lab 2.docx
+++ b/Power BI/Day2/Lab/Power BI Lab 2.docx
@@ -1,6 +1,6 @@
 
 <file path=word/document.xml><?xml version="1.0" encoding="utf-8"?>
-<w:document xmlns:wpc="http://schemas.microsoft.com/office/word/2010/wordprocessingCanvas" xmlns:cx="http://schemas.microsoft.com/office/drawing/2014/chartex" xmlns:cx1="http://schemas.microsoft.com/office/drawing/2015/9/8/chartex" xmlns:cx2="http://schemas.microsoft.com/office/drawing/2015/10/21/chartex" xmlns:cx3="http://schemas.microsoft.com/office/drawing/2016/5/9/chartex" xmlns:cx4="http://schemas.microsoft.com/office/drawing/2016/5/10/chartex" xmlns:cx5="http://schemas.microsoft.com/office/drawing/2016/5/11/chartex" xmlns:cx6="http://schemas.microsoft.com/office/drawing/2016/5/12/chartex" xmlns:cx7="http://schemas.microsoft.com/office/drawing/2016/5/13/chartex" xmlns:cx8="http://schemas.microsoft.com/office/drawing/2016/5/14/chartex" xmlns:mc="http://schemas.openxmlformats.org/markup-compatibility/2006" xmlns:aink="http://schemas.microsoft.com/office/drawing/2016/ink" xmlns:am3d="http://schemas.microsoft.com/office/drawing/2017/model3d" xmlns:o="urn:schemas-microsoft-com:office:office" xmlns:oel="http://schemas.microsoft.com/office/2019/extlst" xmlns:r="http://schemas.openxmlformats.org/officeDocument/2006/relationships" xmlns:m="http://schemas.openxmlformats.org/officeDocument/2006/math" xmlns:v="urn:schemas-microsoft-com:vml" xmlns:wp14="http://schemas.microsoft.com/office/word/2010/wordprocessingDrawing" xmlns:wp="http://schemas.openxmlformats.org/drawingml/2006/wordprocessingDrawing" xmlns:w10="urn:schemas-microsoft-com:office:word" xmlns:w="http://schemas.openxmlformats.org/wordprocessingml/2006/main" xmlns:w14="http://schemas.microsoft.com/office/word/2010/wordml" xmlns:w15="http://schemas.microsoft.com/office/word/2012/wordml" xmlns:w16cex="http://schemas.microsoft.com/office/word/2018/wordml/cex" xmlns:w16cid="http://schemas.microsoft.com/office/word/2016/wordml/cid" xmlns:w16="http://schemas.microsoft.com/office/word/2018/wordml" xmlns:w16sdtdh="http://schemas.microsoft.com/office/word/2020/wordml/sdtdatahash" xmlns:w16se="http://schemas.microsoft.com/office/word/2015/wordml/symex" xmlns:wpg="http://schemas.microsoft.com/office/word/2010/wordprocessingGroup" xmlns:wpi="http://schemas.microsoft.com/office/word/2010/wordprocessingInk" xmlns:wne="http://schemas.microsoft.com/office/word/2006/wordml" xmlns:wps="http://schemas.microsoft.com/office/word/2010/wordprocessingShape" mc:Ignorable="w14 w15 w16se w16cid w16 w16cex w16sdtdh wp14">
+<w:document xmlns:wpc="http://schemas.microsoft.com/office/word/2010/wordprocessingCanvas" xmlns:cx="http://schemas.microsoft.com/office/drawing/2014/chartex" xmlns:cx1="http://schemas.microsoft.com/office/drawing/2015/9/8/chartex" xmlns:cx2="http://schemas.microsoft.com/office/drawing/2015/10/21/chartex" xmlns:cx3="http://schemas.microsoft.com/office/drawing/2016/5/9/chartex" xmlns:cx4="http://schemas.microsoft.com/office/drawing/2016/5/10/chartex" xmlns:cx5="http://schemas.microsoft.com/office/drawing/2016/5/11/chartex" xmlns:cx6="http://schemas.microsoft.com/office/drawing/2016/5/12/chartex" xmlns:cx7="http://schemas.microsoft.com/office/drawing/2016/5/13/chartex" xmlns:cx8="http://schemas.microsoft.com/office/drawing/2016/5/14/chartex" xmlns:mc="http://schemas.openxmlformats.org/markup-compatibility/2006" xmlns:aink="http://schemas.microsoft.com/office/drawing/2016/ink" xmlns:am3d="http://schemas.microsoft.com/office/drawing/2017/model3d" xmlns:o="urn:schemas-microsoft-com:office:office" xmlns:oel="http://schemas.microsoft.com/office/2019/extlst" xmlns:r="http://schemas.openxmlformats.org/officeDocument/2006/relationships" xmlns:m="http://schemas.openxmlformats.org/officeDocument/2006/math" xmlns:v="urn:schemas-microsoft-com:vml" xmlns:wp14="http://schemas.microsoft.com/office/word/2010/wordprocessingDrawing" xmlns:wp="http://schemas.openxmlformats.org/drawingml/2006/wordprocessingDrawing" xmlns:w10="urn:schemas-microsoft-com:office:word" xmlns:w="http://schemas.openxmlformats.org/wordprocessingml/2006/main" xmlns:w14="http://schemas.microsoft.com/office/word/2010/wordml" xmlns:w15="http://schemas.microsoft.com/office/word/2012/wordml" xmlns:w16cex="http://schemas.microsoft.com/office/word/2018/wordml/cex" xmlns:w16cid="http://schemas.microsoft.com/office/word/2016/wordml/cid" xmlns:w16="http://schemas.microsoft.com/office/word/2018/wordml" xmlns:w16du="http://schemas.microsoft.com/office/word/2023/wordml/word16du" xmlns:w16sdtdh="http://schemas.microsoft.com/office/word/2020/wordml/sdtdatahash" xmlns:w16sdtfl="http://schemas.microsoft.com/office/word/2024/wordml/sdtformatlock" xmlns:w16se="http://schemas.microsoft.com/office/word/2015/wordml/symex" xmlns:wpg="http://schemas.microsoft.com/office/word/2010/wordprocessingGroup" xmlns:wpi="http://schemas.microsoft.com/office/word/2010/wordprocessingInk" xmlns:wne="http://schemas.microsoft.com/office/word/2006/wordml" xmlns:wps="http://schemas.microsoft.com/office/word/2010/wordprocessingShape" mc:Ignorable="w14 w15 w16se w16cid w16 w16cex w16sdtdh w16sdtfl w16du wp14">
   <w:body>
     <w:p>
       <w:pPr>
@@ -48,27 +48,7 @@
           <w:sz w:val="24"/>
           <w:szCs w:val="24"/>
         </w:rPr>
-        <w:t xml:space="preserve">Data </w:t>
-      </w:r>
-      <w:proofErr w:type="gramStart"/>
-      <w:r>
-        <w:rPr>
-          <w:b/>
-          <w:bCs/>
-          <w:sz w:val="24"/>
-          <w:szCs w:val="24"/>
-        </w:rPr>
-        <w:t>Source :</w:t>
-      </w:r>
-      <w:proofErr w:type="gramEnd"/>
-      <w:r>
-        <w:rPr>
-          <w:b/>
-          <w:bCs/>
-          <w:sz w:val="24"/>
-          <w:szCs w:val="24"/>
-        </w:rPr>
-        <w:t xml:space="preserve"> </w:t>
+        <w:t xml:space="preserve">Data Source : </w:t>
       </w:r>
       <w:r>
         <w:rPr>
@@ -90,12 +70,14 @@
           <w:bCs/>
           <w:sz w:val="28"/>
           <w:szCs w:val="28"/>
-        </w:rPr>
-      </w:pPr>
-      <w:r>
-        <w:rPr>
-          <w:sz w:val="28"/>
-          <w:szCs w:val="28"/>
+          <w:highlight w:val="lightGray"/>
+        </w:rPr>
+      </w:pPr>
+      <w:r>
+        <w:rPr>
+          <w:sz w:val="28"/>
+          <w:szCs w:val="28"/>
+          <w:highlight w:val="lightGray"/>
         </w:rPr>
         <w:t>Convert this file into a star schema using power query</w:t>
       </w:r>
@@ -112,12 +94,14 @@
           <w:bCs/>
           <w:sz w:val="28"/>
           <w:szCs w:val="28"/>
-        </w:rPr>
-      </w:pPr>
-      <w:r>
-        <w:rPr>
-          <w:sz w:val="28"/>
-          <w:szCs w:val="28"/>
+          <w:highlight w:val="lightGray"/>
+        </w:rPr>
+      </w:pPr>
+      <w:r>
+        <w:rPr>
+          <w:sz w:val="28"/>
+          <w:szCs w:val="28"/>
+          <w:highlight w:val="lightGray"/>
         </w:rPr>
         <w:t>Create Product Hierarchy</w:t>
       </w:r>
@@ -134,12 +118,14 @@
           <w:bCs/>
           <w:sz w:val="28"/>
           <w:szCs w:val="28"/>
-        </w:rPr>
-      </w:pPr>
-      <w:r>
-        <w:rPr>
-          <w:sz w:val="28"/>
-          <w:szCs w:val="28"/>
+          <w:highlight w:val="lightGray"/>
+        </w:rPr>
+      </w:pPr>
+      <w:r>
+        <w:rPr>
+          <w:sz w:val="28"/>
+          <w:szCs w:val="28"/>
+          <w:highlight w:val="lightGray"/>
         </w:rPr>
         <w:t>Create the following measures:</w:t>
       </w:r>
@@ -156,12 +142,14 @@
           <w:bCs/>
           <w:sz w:val="28"/>
           <w:szCs w:val="28"/>
-        </w:rPr>
-      </w:pPr>
-      <w:r>
-        <w:rPr>
-          <w:sz w:val="28"/>
-          <w:szCs w:val="28"/>
+          <w:highlight w:val="lightGray"/>
+        </w:rPr>
+      </w:pPr>
+      <w:r>
+        <w:rPr>
+          <w:sz w:val="28"/>
+          <w:szCs w:val="28"/>
+          <w:highlight w:val="lightGray"/>
         </w:rPr>
         <w:t>No. orders</w:t>
       </w:r>
@@ -178,12 +166,14 @@
           <w:bCs/>
           <w:sz w:val="28"/>
           <w:szCs w:val="28"/>
-        </w:rPr>
-      </w:pPr>
-      <w:r>
-        <w:rPr>
-          <w:sz w:val="28"/>
-          <w:szCs w:val="28"/>
+          <w:highlight w:val="lightGray"/>
+        </w:rPr>
+      </w:pPr>
+      <w:r>
+        <w:rPr>
+          <w:sz w:val="28"/>
+          <w:szCs w:val="28"/>
+          <w:highlight w:val="lightGray"/>
         </w:rPr>
         <w:t>No. order details</w:t>
       </w:r>
@@ -200,12 +190,14 @@
           <w:bCs/>
           <w:sz w:val="28"/>
           <w:szCs w:val="28"/>
-        </w:rPr>
-      </w:pPr>
-      <w:r>
-        <w:rPr>
-          <w:sz w:val="28"/>
-          <w:szCs w:val="28"/>
+          <w:highlight w:val="lightGray"/>
+        </w:rPr>
+      </w:pPr>
+      <w:r>
+        <w:rPr>
+          <w:sz w:val="28"/>
+          <w:szCs w:val="28"/>
+          <w:highlight w:val="lightGray"/>
         </w:rPr>
         <w:t>Total</w:t>
       </w:r>
@@ -215,6 +207,7 @@
           <w:bCs/>
           <w:sz w:val="28"/>
           <w:szCs w:val="28"/>
+          <w:highlight w:val="lightGray"/>
         </w:rPr>
         <w:t xml:space="preserve"> </w:t>
       </w:r>
@@ -222,6 +215,7 @@
         <w:rPr>
           <w:sz w:val="28"/>
           <w:szCs w:val="28"/>
+          <w:highlight w:val="lightGray"/>
         </w:rPr>
         <w:t>Subtotal</w:t>
       </w:r>
@@ -238,12 +232,14 @@
           <w:bCs/>
           <w:sz w:val="28"/>
           <w:szCs w:val="28"/>
-        </w:rPr>
-      </w:pPr>
-      <w:r>
-        <w:rPr>
-          <w:sz w:val="28"/>
-          <w:szCs w:val="28"/>
+          <w:highlight w:val="lightGray"/>
+        </w:rPr>
+      </w:pPr>
+      <w:r>
+        <w:rPr>
+          <w:sz w:val="28"/>
+          <w:szCs w:val="28"/>
+          <w:highlight w:val="lightGray"/>
         </w:rPr>
         <w:t>Total Tax</w:t>
       </w:r>
@@ -260,12 +256,14 @@
           <w:bCs/>
           <w:sz w:val="28"/>
           <w:szCs w:val="28"/>
-        </w:rPr>
-      </w:pPr>
-      <w:r>
-        <w:rPr>
-          <w:sz w:val="28"/>
-          <w:szCs w:val="28"/>
+          <w:highlight w:val="lightGray"/>
+        </w:rPr>
+      </w:pPr>
+      <w:r>
+        <w:rPr>
+          <w:sz w:val="28"/>
+          <w:szCs w:val="28"/>
+          <w:highlight w:val="lightGray"/>
         </w:rPr>
         <w:t>Total Freight</w:t>
       </w:r>
@@ -282,12 +280,14 @@
           <w:bCs/>
           <w:sz w:val="28"/>
           <w:szCs w:val="28"/>
-        </w:rPr>
-      </w:pPr>
-      <w:r>
-        <w:rPr>
-          <w:sz w:val="28"/>
-          <w:szCs w:val="28"/>
+          <w:highlight w:val="lightGray"/>
+        </w:rPr>
+      </w:pPr>
+      <w:r>
+        <w:rPr>
+          <w:sz w:val="28"/>
+          <w:szCs w:val="28"/>
+          <w:highlight w:val="lightGray"/>
         </w:rPr>
         <w:t>Total Due</w:t>
       </w:r>
@@ -326,12 +326,14 @@
           <w:bCs/>
           <w:sz w:val="28"/>
           <w:szCs w:val="28"/>
-        </w:rPr>
-      </w:pPr>
-      <w:r>
-        <w:rPr>
-          <w:sz w:val="28"/>
-          <w:szCs w:val="28"/>
+          <w:highlight w:val="lightGray"/>
+        </w:rPr>
+      </w:pPr>
+      <w:r>
+        <w:rPr>
+          <w:sz w:val="28"/>
+          <w:szCs w:val="28"/>
+          <w:highlight w:val="lightGray"/>
         </w:rPr>
         <w:t>No. orders card</w:t>
       </w:r>
@@ -348,12 +350,14 @@
           <w:bCs/>
           <w:sz w:val="28"/>
           <w:szCs w:val="28"/>
-        </w:rPr>
-      </w:pPr>
-      <w:r>
-        <w:rPr>
-          <w:sz w:val="28"/>
-          <w:szCs w:val="28"/>
+          <w:highlight w:val="lightGray"/>
+        </w:rPr>
+      </w:pPr>
+      <w:r>
+        <w:rPr>
+          <w:sz w:val="28"/>
+          <w:szCs w:val="28"/>
+          <w:highlight w:val="lightGray"/>
         </w:rPr>
         <w:t>No. order details card</w:t>
       </w:r>
@@ -370,12 +374,14 @@
           <w:bCs/>
           <w:sz w:val="28"/>
           <w:szCs w:val="28"/>
-        </w:rPr>
-      </w:pPr>
-      <w:r>
-        <w:rPr>
-          <w:sz w:val="28"/>
-          <w:szCs w:val="28"/>
+          <w:highlight w:val="lightGray"/>
+        </w:rPr>
+      </w:pPr>
+      <w:r>
+        <w:rPr>
+          <w:sz w:val="28"/>
+          <w:szCs w:val="28"/>
+          <w:highlight w:val="lightGray"/>
         </w:rPr>
         <w:t>Total</w:t>
       </w:r>
@@ -385,6 +391,7 @@
           <w:bCs/>
           <w:sz w:val="28"/>
           <w:szCs w:val="28"/>
+          <w:highlight w:val="lightGray"/>
         </w:rPr>
         <w:t xml:space="preserve"> </w:t>
       </w:r>
@@ -392,6 +399,7 @@
         <w:rPr>
           <w:sz w:val="28"/>
           <w:szCs w:val="28"/>
+          <w:highlight w:val="lightGray"/>
         </w:rPr>
         <w:t>Subtotal card</w:t>
       </w:r>
@@ -408,12 +416,14 @@
           <w:bCs/>
           <w:sz w:val="28"/>
           <w:szCs w:val="28"/>
-        </w:rPr>
-      </w:pPr>
-      <w:r>
-        <w:rPr>
-          <w:sz w:val="28"/>
-          <w:szCs w:val="28"/>
+          <w:highlight w:val="lightGray"/>
+        </w:rPr>
+      </w:pPr>
+      <w:r>
+        <w:rPr>
+          <w:sz w:val="28"/>
+          <w:szCs w:val="28"/>
+          <w:highlight w:val="lightGray"/>
         </w:rPr>
         <w:t>Total Tax card</w:t>
       </w:r>
@@ -430,12 +440,14 @@
           <w:bCs/>
           <w:sz w:val="28"/>
           <w:szCs w:val="28"/>
-        </w:rPr>
-      </w:pPr>
-      <w:r>
-        <w:rPr>
-          <w:sz w:val="28"/>
-          <w:szCs w:val="28"/>
+          <w:highlight w:val="lightGray"/>
+        </w:rPr>
+      </w:pPr>
+      <w:r>
+        <w:rPr>
+          <w:sz w:val="28"/>
+          <w:szCs w:val="28"/>
+          <w:highlight w:val="lightGray"/>
         </w:rPr>
         <w:t>Total Freight card</w:t>
       </w:r>
@@ -452,12 +464,14 @@
           <w:bCs/>
           <w:sz w:val="28"/>
           <w:szCs w:val="28"/>
-        </w:rPr>
-      </w:pPr>
-      <w:r>
-        <w:rPr>
-          <w:sz w:val="28"/>
-          <w:szCs w:val="28"/>
+          <w:highlight w:val="lightGray"/>
+        </w:rPr>
+      </w:pPr>
+      <w:r>
+        <w:rPr>
+          <w:sz w:val="28"/>
+          <w:szCs w:val="28"/>
+          <w:highlight w:val="lightGray"/>
         </w:rPr>
         <w:t>Total Due card</w:t>
       </w:r>
@@ -496,12 +510,14 @@
           <w:bCs/>
           <w:sz w:val="28"/>
           <w:szCs w:val="28"/>
-        </w:rPr>
-      </w:pPr>
-      <w:r>
-        <w:rPr>
-          <w:sz w:val="28"/>
-          <w:szCs w:val="28"/>
+          <w:highlight w:val="lightGray"/>
+        </w:rPr>
+      </w:pPr>
+      <w:r>
+        <w:rPr>
+          <w:sz w:val="28"/>
+          <w:szCs w:val="28"/>
+          <w:highlight w:val="lightGray"/>
         </w:rPr>
         <w:t>No. orders by OrderDate</w:t>
       </w:r>
@@ -518,12 +534,14 @@
           <w:bCs/>
           <w:sz w:val="28"/>
           <w:szCs w:val="28"/>
-        </w:rPr>
-      </w:pPr>
-      <w:r>
-        <w:rPr>
-          <w:sz w:val="28"/>
-          <w:szCs w:val="28"/>
+          <w:highlight w:val="lightGray"/>
+        </w:rPr>
+      </w:pPr>
+      <w:r>
+        <w:rPr>
+          <w:sz w:val="28"/>
+          <w:szCs w:val="28"/>
+          <w:highlight w:val="lightGray"/>
         </w:rPr>
         <w:t>No. orders by Status</w:t>
       </w:r>
@@ -540,12 +558,14 @@
           <w:bCs/>
           <w:sz w:val="28"/>
           <w:szCs w:val="28"/>
-        </w:rPr>
-      </w:pPr>
-      <w:r>
-        <w:rPr>
-          <w:sz w:val="28"/>
-          <w:szCs w:val="28"/>
+          <w:highlight w:val="lightGray"/>
+        </w:rPr>
+      </w:pPr>
+      <w:r>
+        <w:rPr>
+          <w:sz w:val="28"/>
+          <w:szCs w:val="28"/>
+          <w:highlight w:val="lightGray"/>
         </w:rPr>
         <w:t>No. orders by Category, SubCategory, Product (use the product hierarchy)</w:t>
       </w:r>
@@ -562,12 +582,14 @@
           <w:bCs/>
           <w:sz w:val="28"/>
           <w:szCs w:val="28"/>
-        </w:rPr>
-      </w:pPr>
-      <w:r>
-        <w:rPr>
-          <w:sz w:val="28"/>
-          <w:szCs w:val="28"/>
+          <w:highlight w:val="lightGray"/>
+        </w:rPr>
+      </w:pPr>
+      <w:r>
+        <w:rPr>
+          <w:sz w:val="28"/>
+          <w:szCs w:val="28"/>
+          <w:highlight w:val="lightGray"/>
         </w:rPr>
         <w:t>No. orders by Territory</w:t>
       </w:r>
@@ -584,29 +606,16 @@
           <w:bCs/>
           <w:sz w:val="28"/>
           <w:szCs w:val="28"/>
-        </w:rPr>
-      </w:pPr>
-      <w:r>
-        <w:rPr>
-          <w:sz w:val="28"/>
-          <w:szCs w:val="28"/>
-        </w:rPr>
-        <w:t xml:space="preserve">Search about tooltip </w:t>
-      </w:r>
-      <w:r>
-        <w:rPr>
-          <w:sz w:val="28"/>
-          <w:szCs w:val="28"/>
-          <w:highlight w:val="yellow"/>
-        </w:rPr>
-        <w:t>page</w:t>
-      </w:r>
-      <w:r>
-        <w:rPr>
-          <w:sz w:val="28"/>
-          <w:szCs w:val="28"/>
-        </w:rPr>
-        <w:t xml:space="preserve"> and try to make it</w:t>
+          <w:highlight w:val="lightGray"/>
+        </w:rPr>
+      </w:pPr>
+      <w:r>
+        <w:rPr>
+          <w:sz w:val="28"/>
+          <w:szCs w:val="28"/>
+          <w:highlight w:val="lightGray"/>
+        </w:rPr>
+        <w:t>Search about tooltip page and try to make it</w:t>
       </w:r>
     </w:p>
     <w:p>
@@ -621,12 +630,14 @@
           <w:bCs/>
           <w:sz w:val="28"/>
           <w:szCs w:val="28"/>
-        </w:rPr>
-      </w:pPr>
-      <w:r>
-        <w:rPr>
-          <w:sz w:val="28"/>
-          <w:szCs w:val="28"/>
+          <w:highlight w:val="lightGray"/>
+        </w:rPr>
+      </w:pPr>
+      <w:r>
+        <w:rPr>
+          <w:sz w:val="28"/>
+          <w:szCs w:val="28"/>
+          <w:highlight w:val="lightGray"/>
         </w:rPr>
         <w:t>Focus on creating a well-designed and visually appealing report</w:t>
       </w:r>
@@ -642,7 +653,7 @@
 </file>
 
 <file path=word/endnotes.xml><?xml version="1.0" encoding="utf-8"?>
-<w:endnotes xmlns:wpc="http://schemas.microsoft.com/office/word/2010/wordprocessingCanvas" xmlns:cx="http://schemas.microsoft.com/office/drawing/2014/chartex" xmlns:cx1="http://schemas.microsoft.com/office/drawing/2015/9/8/chartex" xmlns:cx2="http://schemas.microsoft.com/office/drawing/2015/10/21/chartex" xmlns:cx3="http://schemas.microsoft.com/office/drawing/2016/5/9/chartex" xmlns:cx4="http://schemas.microsoft.com/office/drawing/2016/5/10/chartex" xmlns:cx5="http://schemas.microsoft.com/office/drawing/2016/5/11/chartex" xmlns:cx6="http://schemas.microsoft.com/office/drawing/2016/5/12/chartex" xmlns:cx7="http://schemas.microsoft.com/office/drawing/2016/5/13/chartex" xmlns:cx8="http://schemas.microsoft.com/office/drawing/2016/5/14/chartex" xmlns:mc="http://schemas.openxmlformats.org/markup-compatibility/2006" xmlns:aink="http://schemas.microsoft.com/office/drawing/2016/ink" xmlns:am3d="http://schemas.microsoft.com/office/drawing/2017/model3d" xmlns:o="urn:schemas-microsoft-com:office:office" xmlns:oel="http://schemas.microsoft.com/office/2019/extlst" xmlns:r="http://schemas.openxmlformats.org/officeDocument/2006/relationships" xmlns:m="http://schemas.openxmlformats.org/officeDocument/2006/math" xmlns:v="urn:schemas-microsoft-com:vml" xmlns:wp14="http://schemas.microsoft.com/office/word/2010/wordprocessingDrawing" xmlns:wp="http://schemas.openxmlformats.org/drawingml/2006/wordprocessingDrawing" xmlns:w10="urn:schemas-microsoft-com:office:word" xmlns:w="http://schemas.openxmlformats.org/wordprocessingml/2006/main" xmlns:w14="http://schemas.microsoft.com/office/word/2010/wordml" xmlns:w15="http://schemas.microsoft.com/office/word/2012/wordml" xmlns:w16cex="http://schemas.microsoft.com/office/word/2018/wordml/cex" xmlns:w16cid="http://schemas.microsoft.com/office/word/2016/wordml/cid" xmlns:w16="http://schemas.microsoft.com/office/word/2018/wordml" xmlns:w16sdtdh="http://schemas.microsoft.com/office/word/2020/wordml/sdtdatahash" xmlns:w16se="http://schemas.microsoft.com/office/word/2015/wordml/symex" xmlns:wpg="http://schemas.microsoft.com/office/word/2010/wordprocessingGroup" xmlns:wpi="http://schemas.microsoft.com/office/word/2010/wordprocessingInk" xmlns:wne="http://schemas.microsoft.com/office/word/2006/wordml" xmlns:wps="http://schemas.microsoft.com/office/word/2010/wordprocessingShape" mc:Ignorable="w14 w15 w16se w16cid w16 w16cex w16sdtdh wp14">
+<w:endnotes xmlns:wpc="http://schemas.microsoft.com/office/word/2010/wordprocessingCanvas" xmlns:cx="http://schemas.microsoft.com/office/drawing/2014/chartex" xmlns:cx1="http://schemas.microsoft.com/office/drawing/2015/9/8/chartex" xmlns:cx2="http://schemas.microsoft.com/office/drawing/2015/10/21/chartex" xmlns:cx3="http://schemas.microsoft.com/office/drawing/2016/5/9/chartex" xmlns:cx4="http://schemas.microsoft.com/office/drawing/2016/5/10/chartex" xmlns:cx5="http://schemas.microsoft.com/office/drawing/2016/5/11/chartex" xmlns:cx6="http://schemas.microsoft.com/office/drawing/2016/5/12/chartex" xmlns:cx7="http://schemas.microsoft.com/office/drawing/2016/5/13/chartex" xmlns:cx8="http://schemas.microsoft.com/office/drawing/2016/5/14/chartex" xmlns:mc="http://schemas.openxmlformats.org/markup-compatibility/2006" xmlns:aink="http://schemas.microsoft.com/office/drawing/2016/ink" xmlns:am3d="http://schemas.microsoft.com/office/drawing/2017/model3d" xmlns:o="urn:schemas-microsoft-com:office:office" xmlns:oel="http://schemas.microsoft.com/office/2019/extlst" xmlns:r="http://schemas.openxmlformats.org/officeDocument/2006/relationships" xmlns:m="http://schemas.openxmlformats.org/officeDocument/2006/math" xmlns:v="urn:schemas-microsoft-com:vml" xmlns:wp14="http://schemas.microsoft.com/office/word/2010/wordprocessingDrawing" xmlns:wp="http://schemas.openxmlformats.org/drawingml/2006/wordprocessingDrawing" xmlns:w10="urn:schemas-microsoft-com:office:word" xmlns:w="http://schemas.openxmlformats.org/wordprocessingml/2006/main" xmlns:w14="http://schemas.microsoft.com/office/word/2010/wordml" xmlns:w15="http://schemas.microsoft.com/office/word/2012/wordml" xmlns:w16cex="http://schemas.microsoft.com/office/word/2018/wordml/cex" xmlns:w16cid="http://schemas.microsoft.com/office/word/2016/wordml/cid" xmlns:w16="http://schemas.microsoft.com/office/word/2018/wordml" xmlns:w16du="http://schemas.microsoft.com/office/word/2023/wordml/word16du" xmlns:w16sdtdh="http://schemas.microsoft.com/office/word/2020/wordml/sdtdatahash" xmlns:w16sdtfl="http://schemas.microsoft.com/office/word/2024/wordml/sdtformatlock" xmlns:w16se="http://schemas.microsoft.com/office/word/2015/wordml/symex" xmlns:wpg="http://schemas.microsoft.com/office/word/2010/wordprocessingGroup" xmlns:wpi="http://schemas.microsoft.com/office/word/2010/wordprocessingInk" xmlns:wne="http://schemas.microsoft.com/office/word/2006/wordml" xmlns:wps="http://schemas.microsoft.com/office/word/2010/wordprocessingShape" mc:Ignorable="w14 w15 w16se w16cid w16 w16cex w16sdtdh w16sdtfl w16du wp14">
   <w:endnote w:type="separator" w:id="-1">
     <w:p>
       <w:pPr>
@@ -667,7 +678,7 @@
 </file>
 
 <file path=word/footnotes.xml><?xml version="1.0" encoding="utf-8"?>
-<w:footnotes xmlns:wpc="http://schemas.microsoft.com/office/word/2010/wordprocessingCanvas" xmlns:cx="http://schemas.microsoft.com/office/drawing/2014/chartex" xmlns:cx1="http://schemas.microsoft.com/office/drawing/2015/9/8/chartex" xmlns:cx2="http://schemas.microsoft.com/office/drawing/2015/10/21/chartex" xmlns:cx3="http://schemas.microsoft.com/office/drawing/2016/5/9/chartex" xmlns:cx4="http://schemas.microsoft.com/office/drawing/2016/5/10/chartex" xmlns:cx5="http://schemas.microsoft.com/office/drawing/2016/5/11/chartex" xmlns:cx6="http://schemas.microsoft.com/office/drawing/2016/5/12/chartex" xmlns:cx7="http://schemas.microsoft.com/office/drawing/2016/5/13/chartex" xmlns:cx8="http://schemas.microsoft.com/office/drawing/2016/5/14/chartex" xmlns:mc="http://schemas.openxmlformats.org/markup-compatibility/2006" xmlns:aink="http://schemas.microsoft.com/office/drawing/2016/ink" xmlns:am3d="http://schemas.microsoft.com/office/drawing/2017/model3d" xmlns:o="urn:schemas-microsoft-com:office:office" xmlns:oel="http://schemas.microsoft.com/office/2019/extlst" xmlns:r="http://schemas.openxmlformats.org/officeDocument/2006/relationships" xmlns:m="http://schemas.openxmlformats.org/officeDocument/2006/math" xmlns:v="urn:schemas-microsoft-com:vml" xmlns:wp14="http://schemas.microsoft.com/office/word/2010/wordprocessingDrawing" xmlns:wp="http://schemas.openxmlformats.org/drawingml/2006/wordprocessingDrawing" xmlns:w10="urn:schemas-microsoft-com:office:word" xmlns:w="http://schemas.openxmlformats.org/wordprocessingml/2006/main" xmlns:w14="http://schemas.microsoft.com/office/word/2010/wordml" xmlns:w15="http://schemas.microsoft.com/office/word/2012/wordml" xmlns:w16cex="http://schemas.microsoft.com/office/word/2018/wordml/cex" xmlns:w16cid="http://schemas.microsoft.com/office/word/2016/wordml/cid" xmlns:w16="http://schemas.microsoft.com/office/word/2018/wordml" xmlns:w16sdtdh="http://schemas.microsoft.com/office/word/2020/wordml/sdtdatahash" xmlns:w16se="http://schemas.microsoft.com/office/word/2015/wordml/symex" xmlns:wpg="http://schemas.microsoft.com/office/word/2010/wordprocessingGroup" xmlns:wpi="http://schemas.microsoft.com/office/word/2010/wordprocessingInk" xmlns:wne="http://schemas.microsoft.com/office/word/2006/wordml" xmlns:wps="http://schemas.microsoft.com/office/word/2010/wordprocessingShape" mc:Ignorable="w14 w15 w16se w16cid w16 w16cex w16sdtdh wp14">
+<w:footnotes xmlns:wpc="http://schemas.microsoft.com/office/word/2010/wordprocessingCanvas" xmlns:cx="http://schemas.microsoft.com/office/drawing/2014/chartex" xmlns:cx1="http://schemas.microsoft.com/office/drawing/2015/9/8/chartex" xmlns:cx2="http://schemas.microsoft.com/office/drawing/2015/10/21/chartex" xmlns:cx3="http://schemas.microsoft.com/office/drawing/2016/5/9/chartex" xmlns:cx4="http://schemas.microsoft.com/office/drawing/2016/5/10/chartex" xmlns:cx5="http://schemas.microsoft.com/office/drawing/2016/5/11/chartex" xmlns:cx6="http://schemas.microsoft.com/office/drawing/2016/5/12/chartex" xmlns:cx7="http://schemas.microsoft.com/office/drawing/2016/5/13/chartex" xmlns:cx8="http://schemas.microsoft.com/office/drawing/2016/5/14/chartex" xmlns:mc="http://schemas.openxmlformats.org/markup-compatibility/2006" xmlns:aink="http://schemas.microsoft.com/office/drawing/2016/ink" xmlns:am3d="http://schemas.microsoft.com/office/drawing/2017/model3d" xmlns:o="urn:schemas-microsoft-com:office:office" xmlns:oel="http://schemas.microsoft.com/office/2019/extlst" xmlns:r="http://schemas.openxmlformats.org/officeDocument/2006/relationships" xmlns:m="http://schemas.openxmlformats.org/officeDocument/2006/math" xmlns:v="urn:schemas-microsoft-com:vml" xmlns:wp14="http://schemas.microsoft.com/office/word/2010/wordprocessingDrawing" xmlns:wp="http://schemas.openxmlformats.org/drawingml/2006/wordprocessingDrawing" xmlns:w10="urn:schemas-microsoft-com:office:word" xmlns:w="http://schemas.openxmlformats.org/wordprocessingml/2006/main" xmlns:w14="http://schemas.microsoft.com/office/word/2010/wordml" xmlns:w15="http://schemas.microsoft.com/office/word/2012/wordml" xmlns:w16cex="http://schemas.microsoft.com/office/word/2018/wordml/cex" xmlns:w16cid="http://schemas.microsoft.com/office/word/2016/wordml/cid" xmlns:w16="http://schemas.microsoft.com/office/word/2018/wordml" xmlns:w16du="http://schemas.microsoft.com/office/word/2023/wordml/word16du" xmlns:w16sdtdh="http://schemas.microsoft.com/office/word/2020/wordml/sdtdatahash" xmlns:w16sdtfl="http://schemas.microsoft.com/office/word/2024/wordml/sdtformatlock" xmlns:w16se="http://schemas.microsoft.com/office/word/2015/wordml/symex" xmlns:wpg="http://schemas.microsoft.com/office/word/2010/wordprocessingGroup" xmlns:wpi="http://schemas.microsoft.com/office/word/2010/wordprocessingInk" xmlns:wne="http://schemas.microsoft.com/office/word/2006/wordml" xmlns:wps="http://schemas.microsoft.com/office/word/2010/wordprocessingShape" mc:Ignorable="w14 w15 w16se w16cid w16 w16cex w16sdtdh w16sdtfl w16du wp14">
   <w:footnote w:type="separator" w:id="-1">
     <w:p>
       <w:pPr>
@@ -692,7 +703,7 @@
 </file>
 
 <file path=word/numbering.xml><?xml version="1.0" encoding="utf-8"?>
-<w:numbering xmlns:wpc="http://schemas.microsoft.com/office/word/2010/wordprocessingCanvas" xmlns:cx="http://schemas.microsoft.com/office/drawing/2014/chartex" xmlns:cx1="http://schemas.microsoft.com/office/drawing/2015/9/8/chartex" xmlns:cx2="http://schemas.microsoft.com/office/drawing/2015/10/21/chartex" xmlns:cx3="http://schemas.microsoft.com/office/drawing/2016/5/9/chartex" xmlns:cx4="http://schemas.microsoft.com/office/drawing/2016/5/10/chartex" xmlns:cx5="http://schemas.microsoft.com/office/drawing/2016/5/11/chartex" xmlns:cx6="http://schemas.microsoft.com/office/drawing/2016/5/12/chartex" xmlns:cx7="http://schemas.microsoft.com/office/drawing/2016/5/13/chartex" xmlns:cx8="http://schemas.microsoft.com/office/drawing/2016/5/14/chartex" xmlns:mc="http://schemas.openxmlformats.org/markup-compatibility/2006" xmlns:aink="http://schemas.microsoft.com/office/drawing/2016/ink" xmlns:am3d="http://schemas.microsoft.com/office/drawing/2017/model3d" xmlns:o="urn:schemas-microsoft-com:office:office" xmlns:oel="http://schemas.microsoft.com/office/2019/extlst" xmlns:r="http://schemas.openxmlformats.org/officeDocument/2006/relationships" xmlns:m="http://schemas.openxmlformats.org/officeDocument/2006/math" xmlns:v="urn:schemas-microsoft-com:vml" xmlns:wp14="http://schemas.microsoft.com/office/word/2010/wordprocessingDrawing" xmlns:wp="http://schemas.openxmlformats.org/drawingml/2006/wordprocessingDrawing" xmlns:w10="urn:schemas-microsoft-com:office:word" xmlns:w="http://schemas.openxmlformats.org/wordprocessingml/2006/main" xmlns:w14="http://schemas.microsoft.com/office/word/2010/wordml" xmlns:w15="http://schemas.microsoft.com/office/word/2012/wordml" xmlns:w16cex="http://schemas.microsoft.com/office/word/2018/wordml/cex" xmlns:w16cid="http://schemas.microsoft.com/office/word/2016/wordml/cid" xmlns:w16="http://schemas.microsoft.com/office/word/2018/wordml" xmlns:w16sdtdh="http://schemas.microsoft.com/office/word/2020/wordml/sdtdatahash" xmlns:w16se="http://schemas.microsoft.com/office/word/2015/wordml/symex" xmlns:wpg="http://schemas.microsoft.com/office/word/2010/wordprocessingGroup" xmlns:wpi="http://schemas.microsoft.com/office/word/2010/wordprocessingInk" xmlns:wne="http://schemas.microsoft.com/office/word/2006/wordml" xmlns:wps="http://schemas.microsoft.com/office/word/2010/wordprocessingShape" mc:Ignorable="w14 w15 w16se w16cid w16 w16cex w16sdtdh wp14">
+<w:numbering xmlns:wpc="http://schemas.microsoft.com/office/word/2010/wordprocessingCanvas" xmlns:cx="http://schemas.microsoft.com/office/drawing/2014/chartex" xmlns:cx1="http://schemas.microsoft.com/office/drawing/2015/9/8/chartex" xmlns:cx2="http://schemas.microsoft.com/office/drawing/2015/10/21/chartex" xmlns:cx3="http://schemas.microsoft.com/office/drawing/2016/5/9/chartex" xmlns:cx4="http://schemas.microsoft.com/office/drawing/2016/5/10/chartex" xmlns:cx5="http://schemas.microsoft.com/office/drawing/2016/5/11/chartex" xmlns:cx6="http://schemas.microsoft.com/office/drawing/2016/5/12/chartex" xmlns:cx7="http://schemas.microsoft.com/office/drawing/2016/5/13/chartex" xmlns:cx8="http://schemas.microsoft.com/office/drawing/2016/5/14/chartex" xmlns:mc="http://schemas.openxmlformats.org/markup-compatibility/2006" xmlns:aink="http://schemas.microsoft.com/office/drawing/2016/ink" xmlns:am3d="http://schemas.microsoft.com/office/drawing/2017/model3d" xmlns:o="urn:schemas-microsoft-com:office:office" xmlns:oel="http://schemas.microsoft.com/office/2019/extlst" xmlns:r="http://schemas.openxmlformats.org/officeDocument/2006/relationships" xmlns:m="http://schemas.openxmlformats.org/officeDocument/2006/math" xmlns:v="urn:schemas-microsoft-com:vml" xmlns:wp14="http://schemas.microsoft.com/office/word/2010/wordprocessingDrawing" xmlns:wp="http://schemas.openxmlformats.org/drawingml/2006/wordprocessingDrawing" xmlns:w10="urn:schemas-microsoft-com:office:word" xmlns:w="http://schemas.openxmlformats.org/wordprocessingml/2006/main" xmlns:w14="http://schemas.microsoft.com/office/word/2010/wordml" xmlns:w15="http://schemas.microsoft.com/office/word/2012/wordml" xmlns:w16cex="http://schemas.microsoft.com/office/word/2018/wordml/cex" xmlns:w16cid="http://schemas.microsoft.com/office/word/2016/wordml/cid" xmlns:w16="http://schemas.microsoft.com/office/word/2018/wordml" xmlns:w16du="http://schemas.microsoft.com/office/word/2023/wordml/word16du" xmlns:w16sdtdh="http://schemas.microsoft.com/office/word/2020/wordml/sdtdatahash" xmlns:w16sdtfl="http://schemas.microsoft.com/office/word/2024/wordml/sdtformatlock" xmlns:w16se="http://schemas.microsoft.com/office/word/2015/wordml/symex" xmlns:wpg="http://schemas.microsoft.com/office/word/2010/wordprocessingGroup" xmlns:wpi="http://schemas.microsoft.com/office/word/2010/wordprocessingInk" xmlns:wne="http://schemas.microsoft.com/office/word/2006/wordml" xmlns:wps="http://schemas.microsoft.com/office/word/2010/wordprocessingShape" mc:Ignorable="w14 w15 w16se w16cid w16 w16cex w16sdtdh w16sdtfl w16du wp14">
   <w:abstractNum w:abstractNumId="0" w15:restartNumberingAfterBreak="0">
     <w:nsid w:val="0EE63D32"/>
     <w:multiLevelType w:val="hybridMultilevel"/>
@@ -904,7 +915,7 @@
 </file>
 
 <file path=word/styles.xml><?xml version="1.0" encoding="utf-8"?>
-<w:styles xmlns:mc="http://schemas.openxmlformats.org/markup-compatibility/2006" xmlns:r="http://schemas.openxmlformats.org/officeDocument/2006/relationships" xmlns:w="http://schemas.openxmlformats.org/wordprocessingml/2006/main" xmlns:w14="http://schemas.microsoft.com/office/word/2010/wordml" xmlns:w15="http://schemas.microsoft.com/office/word/2012/wordml" xmlns:w16cex="http://schemas.microsoft.com/office/word/2018/wordml/cex" xmlns:w16cid="http://schemas.microsoft.com/office/word/2016/wordml/cid" xmlns:w16="http://schemas.microsoft.com/office/word/2018/wordml" xmlns:w16sdtdh="http://schemas.microsoft.com/office/word/2020/wordml/sdtdatahash" xmlns:w16se="http://schemas.microsoft.com/office/word/2015/wordml/symex" mc:Ignorable="w14 w15 w16se w16cid w16 w16cex w16sdtdh">
+<w:styles xmlns:mc="http://schemas.openxmlformats.org/markup-compatibility/2006" xmlns:r="http://schemas.openxmlformats.org/officeDocument/2006/relationships" xmlns:w="http://schemas.openxmlformats.org/wordprocessingml/2006/main" xmlns:w14="http://schemas.microsoft.com/office/word/2010/wordml" xmlns:w15="http://schemas.microsoft.com/office/word/2012/wordml" xmlns:w16cex="http://schemas.microsoft.com/office/word/2018/wordml/cex" xmlns:w16cid="http://schemas.microsoft.com/office/word/2016/wordml/cid" xmlns:w16="http://schemas.microsoft.com/office/word/2018/wordml" xmlns:w16du="http://schemas.microsoft.com/office/word/2023/wordml/word16du" xmlns:w16sdtdh="http://schemas.microsoft.com/office/word/2020/wordml/sdtdatahash" xmlns:w16sdtfl="http://schemas.microsoft.com/office/word/2024/wordml/sdtformatlock" xmlns:w16se="http://schemas.microsoft.com/office/word/2015/wordml/symex" mc:Ignorable="w14 w15 w16se w16cid w16 w16cex w16sdtdh w16sdtfl w16du">
   <w:docDefaults>
     <w:rPrDefault>
       <w:rPr>
@@ -2163,6 +2174,26 @@
 </file>
 
 <file path=customXml/item1.xml><?xml version="1.0" encoding="utf-8"?>
+<p:properties xmlns:p="http://schemas.microsoft.com/office/2006/metadata/properties" xmlns:xsi="http://www.w3.org/2001/XMLSchema-instance" xmlns:pc="http://schemas.microsoft.com/office/infopath/2007/PartnerControls">
+  <documentManagement>
+    <lcf76f155ced4ddcb4097134ff3c332f xmlns="a9426f9f-2a6a-403d-9984-0f17e3e6377d">
+      <Terms xmlns="http://schemas.microsoft.com/office/infopath/2007/PartnerControls"/>
+    </lcf76f155ced4ddcb4097134ff3c332f>
+    <TaxCatchAll xmlns="7473d3bc-240f-4a29-9442-65c9b41a6a64" xsi:nil="true"/>
+  </documentManagement>
+</p:properties>
+</file>
+
+<file path=customXml/item2.xml><?xml version="1.0" encoding="utf-8"?>
+<?mso-contentType ?>
+<FormTemplates xmlns="http://schemas.microsoft.com/sharepoint/v3/contenttype/forms">
+  <Display>DocumentLibraryForm</Display>
+  <Edit>DocumentLibraryForm</Edit>
+  <New>DocumentLibraryForm</New>
+</FormTemplates>
+</file>
+
+<file path=customXml/item3.xml><?xml version="1.0" encoding="utf-8"?>
 <ct:contentTypeSchema xmlns:ct="http://schemas.microsoft.com/office/2006/metadata/contentType" xmlns:ma="http://schemas.microsoft.com/office/2006/metadata/properties/metaAttributes" ct:_="" ma:_="" ma:contentTypeName="Document" ma:contentTypeID="0x010100E569843BE9C8A54687BECE1C962241DE" ma:contentTypeVersion="11" ma:contentTypeDescription="Create a new document." ma:contentTypeScope="" ma:versionID="915198f6aa489cfbdc7b9e77b06a6d53">
   <xsd:schema xmlns:xsd="http://www.w3.org/2001/XMLSchema" xmlns:xs="http://www.w3.org/2001/XMLSchema" xmlns:p="http://schemas.microsoft.com/office/2006/metadata/properties" xmlns:ns2="a9426f9f-2a6a-403d-9984-0f17e3e6377d" xmlns:ns3="7473d3bc-240f-4a29-9442-65c9b41a6a64" targetNamespace="http://schemas.microsoft.com/office/2006/metadata/properties" ma:root="true" ma:fieldsID="1eb435882f9df30ba07266d4b609428a" ns2:_="" ns3:_="">
     <xsd:import namespace="a9426f9f-2a6a-403d-9984-0f17e3e6377d"/>
@@ -2357,28 +2388,15 @@
 </ct:contentTypeSchema>
 </file>
 
-<file path=customXml/item2.xml><?xml version="1.0" encoding="utf-8"?>
-<?mso-contentType ?>
-<FormTemplates xmlns="http://schemas.microsoft.com/sharepoint/v3/contenttype/forms">
-  <Display>DocumentLibraryForm</Display>
-  <Edit>DocumentLibraryForm</Edit>
-  <New>DocumentLibraryForm</New>
-</FormTemplates>
-</file>
-
-<file path=customXml/item3.xml><?xml version="1.0" encoding="utf-8"?>
-<p:properties xmlns:p="http://schemas.microsoft.com/office/2006/metadata/properties" xmlns:xsi="http://www.w3.org/2001/XMLSchema-instance" xmlns:pc="http://schemas.microsoft.com/office/infopath/2007/PartnerControls">
-  <documentManagement>
-    <lcf76f155ced4ddcb4097134ff3c332f xmlns="a9426f9f-2a6a-403d-9984-0f17e3e6377d">
-      <Terms xmlns="http://schemas.microsoft.com/office/infopath/2007/PartnerControls"/>
-    </lcf76f155ced4ddcb4097134ff3c332f>
-    <TaxCatchAll xmlns="7473d3bc-240f-4a29-9442-65c9b41a6a64" xsi:nil="true"/>
-  </documentManagement>
-</p:properties>
-</file>
-
 <file path=customXml/itemProps1.xml><?xml version="1.0" encoding="utf-8"?>
-<ds:datastoreItem xmlns:ds="http://schemas.openxmlformats.org/officeDocument/2006/customXml" ds:itemID="{71A84522-A552-4036-B973-BE2DDB4E5BB6}"/>
+<ds:datastoreItem xmlns:ds="http://schemas.openxmlformats.org/officeDocument/2006/customXml" ds:itemID="{0469F236-2879-4D78-84FD-1069F7A92B8E}">
+  <ds:schemaRefs>
+    <ds:schemaRef ds:uri="http://schemas.microsoft.com/office/2006/metadata/properties"/>
+    <ds:schemaRef ds:uri="http://schemas.microsoft.com/office/infopath/2007/PartnerControls"/>
+    <ds:schemaRef ds:uri="a9426f9f-2a6a-403d-9984-0f17e3e6377d"/>
+    <ds:schemaRef ds:uri="7473d3bc-240f-4a29-9442-65c9b41a6a64"/>
+  </ds:schemaRefs>
+</ds:datastoreItem>
 </file>
 
 <file path=customXml/itemProps2.xml><?xml version="1.0" encoding="utf-8"?>
@@ -2390,12 +2408,20 @@
 </file>
 
 <file path=customXml/itemProps3.xml><?xml version="1.0" encoding="utf-8"?>
-<ds:datastoreItem xmlns:ds="http://schemas.openxmlformats.org/officeDocument/2006/customXml" ds:itemID="{0469F236-2879-4D78-84FD-1069F7A92B8E}">
+<ds:datastoreItem xmlns:ds="http://schemas.openxmlformats.org/officeDocument/2006/customXml" ds:itemID="{71A84522-A552-4036-B973-BE2DDB4E5BB6}">
   <ds:schemaRefs>
+    <ds:schemaRef ds:uri="http://schemas.microsoft.com/office/2006/metadata/contentType"/>
+    <ds:schemaRef ds:uri="http://schemas.microsoft.com/office/2006/metadata/properties/metaAttributes"/>
+    <ds:schemaRef ds:uri="http://www.w3.org/2001/XMLSchema"/>
     <ds:schemaRef ds:uri="http://schemas.microsoft.com/office/2006/metadata/properties"/>
+    <ds:schemaRef ds:uri="a9426f9f-2a6a-403d-9984-0f17e3e6377d"/>
+    <ds:schemaRef ds:uri="7473d3bc-240f-4a29-9442-65c9b41a6a64"/>
+    <ds:schemaRef ds:uri="http://schemas.microsoft.com/office/2006/documentManagement/types"/>
     <ds:schemaRef ds:uri="http://schemas.microsoft.com/office/infopath/2007/PartnerControls"/>
-    <ds:schemaRef ds:uri="f894b662-64d7-49da-8371-1e7bea0bc874"/>
-    <ds:schemaRef ds:uri="36860e64-a400-4035-9ebf-caf91c102eb6"/>
+    <ds:schemaRef ds:uri="http://schemas.openxmlformats.org/package/2006/metadata/core-properties"/>
+    <ds:schemaRef ds:uri="http://purl.org/dc/elements/1.1/"/>
+    <ds:schemaRef ds:uri="http://purl.org/dc/terms/"/>
+    <ds:schemaRef ds:uri="http://schemas.microsoft.com/internal/obd"/>
   </ds:schemaRefs>
 </ds:datastoreItem>
 </file>
</xml_diff>